<commit_message>
Wave 3 — engine wiring + Executive Multi-Market Report + brain-path audit (#89)
Wire the engine through the app/services/engine.py seam (HS classification, weighted market ranking, competitor-price provenance, importer agents), ship the Executive Multi-Market Report (view model + Arabic RTL docx + Celery task + endpoint + UI default), and close the adversarial brain-path audit: 18 of 21 findings fixed (both criticals), 3 deferred with rationale. Both live symptoms (HS-classification failure; long-run-then-error) diagnosed before implementation. Full apps/api suite green (463 passed), engine suite green (2548 passed).
</commit_message>
<xml_diff>
--- a/packages/silk_intel/silk_intel/samples/report_full_latest.docx
+++ b/packages/silk_intel/silk_intel/samples/report_full_latest.docx
@@ -371,7 +371,7 @@
                 <w:rFonts w:ascii="IBM Plex Sans Arabic" w:hAnsi="IBM Plex Sans Arabic" w:cs="IBM Plex Sans Arabic"/>
                 <w:rtl/>
               </w:rPr>
-              <w:t>2026-07-29</w:t>
+              <w:t>2026-08-07</w:t>
             </w:r>
           </w:p>
         </w:tc>
@@ -2072,7 +2072,7 @@
                 <w:rFonts w:ascii="IBM Plex Sans Arabic" w:hAnsi="IBM Plex Sans Arabic" w:cs="IBM Plex Sans Arabic"/>
                 <w:rtl/>
               </w:rPr>
-              <w:t>UN Comtrade | سُحب: 2026-07-29 | ثقة: عالية (‏90%‏)</w:t>
+              <w:t>UN Comtrade | سُحب: 2026-08-07 | ثقة: عالية (‏90%‏)</w:t>
             </w:r>
           </w:p>
         </w:tc>
@@ -2174,7 +2174,7 @@
                 <w:rFonts w:ascii="IBM Plex Sans Arabic" w:hAnsi="IBM Plex Sans Arabic" w:cs="IBM Plex Sans Arabic"/>
                 <w:rtl/>
               </w:rPr>
-              <w:t>UN Comtrade (مخزن الحقائق) | سُحب: 2026-07-29 | ثقة: عالية (‏90%‏)</w:t>
+              <w:t>UN Comtrade (مخزن الحقائق) | سُحب: 2026-08-07 | ثقة: عالية (‏90%‏)</w:t>
             </w:r>
           </w:p>
         </w:tc>
@@ -2272,7 +2272,7 @@
                 <w:rFonts w:ascii="IBM Plex Sans Arabic" w:hAnsi="IBM Plex Sans Arabic" w:cs="IBM Plex Sans Arabic"/>
                 <w:rtl/>
               </w:rPr>
-              <w:t>UN Comtrade (مخزن الحقائق) | سُحب: 2026-07-29 | ثقة: عالية (‏90%‏)</w:t>
+              <w:t>UN Comtrade (مخزن الحقائق) | سُحب: 2026-08-07 | ثقة: عالية (‏90%‏)</w:t>
             </w:r>
           </w:p>
         </w:tc>
@@ -3115,7 +3115,7 @@
                 <w:rFonts w:ascii="IBM Plex Sans Arabic" w:hAnsi="IBM Plex Sans Arabic" w:cs="IBM Plex Sans Arabic"/>
                 <w:rtl/>
               </w:rPr>
-              <w:t>UN Comtrade | سُحب: 2026-07-29 | ثقة: عالية (‏90%‏)</w:t>
+              <w:t>UN Comtrade | سُحب: 2026-08-07 | ثقة: عالية (‏90%‏)</w:t>
             </w:r>
           </w:p>
         </w:tc>
@@ -3216,7 +3216,7 @@
                 <w:rFonts w:ascii="IBM Plex Sans Arabic" w:hAnsi="IBM Plex Sans Arabic" w:cs="IBM Plex Sans Arabic"/>
                 <w:rtl/>
               </w:rPr>
-              <w:t>UN Comtrade | سُحب: 2026-07-29 | ثقة: عالية (‏90%‏)</w:t>
+              <w:t>UN Comtrade | سُحب: 2026-08-07 | ثقة: عالية (‏90%‏)</w:t>
             </w:r>
           </w:p>
         </w:tc>
@@ -3315,7 +3315,7 @@
                 <w:rFonts w:ascii="IBM Plex Sans Arabic" w:hAnsi="IBM Plex Sans Arabic" w:cs="IBM Plex Sans Arabic"/>
                 <w:rtl/>
               </w:rPr>
-              <w:t>UN Comtrade | سُحب: 2026-07-29 | ثقة: عالية (‏90%‏)</w:t>
+              <w:t>UN Comtrade | سُحب: 2026-08-07 | ثقة: عالية (‏90%‏)</w:t>
             </w:r>
           </w:p>
         </w:tc>
@@ -3786,7 +3786,7 @@
                 <w:rFonts w:ascii="IBM Plex Sans Arabic" w:hAnsi="IBM Plex Sans Arabic" w:cs="IBM Plex Sans Arabic"/>
                 <w:rtl/>
               </w:rPr>
-              <w:t>UN Comtrade (مخزن الحقائق) | سُحب: 2026-07-29 | ثقة: عالية (‏90%‏)</w:t>
+              <w:t>UN Comtrade (مخزن الحقائق) | سُحب: 2026-08-07 | ثقة: عالية (‏90%‏)</w:t>
             </w:r>
           </w:p>
         </w:tc>
@@ -3888,7 +3888,7 @@
                 <w:rFonts w:ascii="IBM Plex Sans Arabic" w:hAnsi="IBM Plex Sans Arabic" w:cs="IBM Plex Sans Arabic"/>
                 <w:rtl/>
               </w:rPr>
-              <w:t>UN Comtrade (مخزن الحقائق) | سُحب: 2026-07-29 | ثقة: عالية (‏85%‏)</w:t>
+              <w:t>UN Comtrade (مخزن الحقائق) | سُحب: 2026-08-07 | ثقة: عالية (‏85%‏)</w:t>
             </w:r>
           </w:p>
         </w:tc>
@@ -4597,7 +4597,7 @@
           <w:rFonts w:ascii="IBM Plex Sans Arabic" w:hAnsi="IBM Plex Sans Arabic" w:cs="IBM Plex Sans Arabic"/>
           <w:rtl/>
         </w:rPr>
-        <w:t>المصدر: Silk L1 requirements reference (‏official portals / EUR-Lex‏) | سُحب: 2026-07-29 | ثقة: عالية (‏80%‏)</w:t>
+        <w:t>المصدر: Silk L1 requirements reference (‏official portals / EUR-Lex‏) | سُحب: 2026-08-07 | ثقة: عالية (‏80%‏)</w:t>
       </w:r>
     </w:p>
     <w:p>

</xml_diff>